<commit_message>
weekly: update W12 report + add self-check step to SKILL.md
Co-Authored-By: Claude Opus 4.6 <noreply@anthropic.com>
</commit_message>
<xml_diff>
--- a/data/weekly/2026-W12.docx
+++ b/data/weekly/2026-W12.docx
@@ -425,7 +425,7 @@
           <w:sz w:val="22"/>
           <w:szCs w:val="22"/>
         </w:rPr>
-        <w:t xml:space="preserve">这场基础设施战争不是突然出现的。它之所以在本周从潜流变为显流，有一个清晰的触发条件：上周GPT-5.4的发布使Agent能力达到了”可部署”的阈值——原生计算机操作、100万token上下文、完整工具调用。当模型已经”够用”，瓶颈自然转向”Agent如何安全、稳定地嵌入用户的日常工作环境”——这正是基础设施要解决的问题。</w:t>
+        <w:t xml:space="preserve">这场基础设施战争不是突然出现的。它之所以在本周从潜流变为显流，有一个重要的背景条件：过去半年间，前沿模型的Agent能力密集升级——Claude在2024年10月率先推出computer use，Gemini早在2024年初就拥有100万token上下文，GPT-5.4上周又将计算机操作、长上下文和工具调用整合到一个模型中。当多家模型同时具备”足够用”的Agent能力后，模型层不再是瓶颈，竞争自然转向”Agent如何安全、稳定地嵌入用户的日常工作环境”——这正是基础设施层要解决的问题。</w:t>
       </w:r>
     </w:p>
     <w:p>
@@ -1011,7 +1011,7 @@
         </w:rPr>
         <w:t xml:space="preserve">来源：</w:t>
       </w:r>
-      <w:hyperlink w:history="1" r:id="rIdb3dpbpkap4efpmm7pehl0">
+      <w:hyperlink w:history="1" r:id="rIdzkvqblhewdk4r07csnsys">
         <w:r>
           <w:rPr>
             <w:rStyle w:val="Hyperlink"/>
@@ -1069,7 +1069,7 @@
         </w:rPr>
         <w:t xml:space="preserve">来源：</w:t>
       </w:r>
-      <w:hyperlink w:history="1" r:id="rId-fwobintpj9wrlouojbdt">
+      <w:hyperlink w:history="1" r:id="rId9azefal_gqodhri-ebpre">
         <w:r>
           <w:rPr>
             <w:rStyle w:val="Hyperlink"/>
@@ -1127,7 +1127,7 @@
         </w:rPr>
         <w:t xml:space="preserve">来源：</w:t>
       </w:r>
-      <w:hyperlink w:history="1" r:id="rId-ur8pmxhqhra28-ptub5u">
+      <w:hyperlink w:history="1" r:id="rIdcauduq6y8je6aaotd0ljw">
         <w:r>
           <w:rPr>
             <w:rStyle w:val="Hyperlink"/>
@@ -1185,7 +1185,7 @@
         </w:rPr>
         <w:t xml:space="preserve">来源：</w:t>
       </w:r>
-      <w:hyperlink w:history="1" r:id="rIdn3zmel1ycmnadh4wywmcb">
+      <w:hyperlink w:history="1" r:id="rIdzb-ogrcaovwmdizuza5ka">
         <w:r>
           <w:rPr>
             <w:rStyle w:val="Hyperlink"/>
@@ -1209,7 +1209,7 @@
         </w:rPr>
         <w:t xml:space="preserve"> · </w:t>
       </w:r>
-      <w:hyperlink w:history="1" r:id="rId97mti5gipujy6qibe4rv2">
+      <w:hyperlink w:history="1" r:id="rId723h0r0qb9re-7srona_u">
         <w:r>
           <w:rPr>
             <w:rStyle w:val="Hyperlink"/>
@@ -1267,7 +1267,7 @@
         </w:rPr>
         <w:t xml:space="preserve">来源：</w:t>
       </w:r>
-      <w:hyperlink w:history="1" r:id="rIdppajxl2p0axkalmaedwcq">
+      <w:hyperlink w:history="1" r:id="rIdn_kd9ew0qiaxmwuc2hdnu">
         <w:r>
           <w:rPr>
             <w:rStyle w:val="Hyperlink"/>
@@ -1291,7 +1291,7 @@
         </w:rPr>
         <w:t xml:space="preserve"> · </w:t>
       </w:r>
-      <w:hyperlink w:history="1" r:id="rIdxxuqyhob5hvdcs6yqgp9s">
+      <w:hyperlink w:history="1" r:id="rIde8md6choa6jkkatu_q3jj">
         <w:r>
           <w:rPr>
             <w:rStyle w:val="Hyperlink"/>
@@ -1349,7 +1349,7 @@
         </w:rPr>
         <w:t xml:space="preserve">来源：</w:t>
       </w:r>
-      <w:hyperlink w:history="1" r:id="rId7fmv4koiyabszivvb0k9w">
+      <w:hyperlink w:history="1" r:id="rIdflyoeuvjsza5yz8dkumaw">
         <w:r>
           <w:rPr>
             <w:rStyle w:val="Hyperlink"/>
@@ -1373,7 +1373,7 @@
         </w:rPr>
         <w:t xml:space="preserve"> · </w:t>
       </w:r>
-      <w:hyperlink w:history="1" r:id="rIdp2dnbmvi0oog8ny_dgtti">
+      <w:hyperlink w:history="1" r:id="rIdknbmvgoaqiz2hh13dbw2t">
         <w:r>
           <w:rPr>
             <w:rStyle w:val="Hyperlink"/>
@@ -1431,7 +1431,7 @@
         </w:rPr>
         <w:t xml:space="preserve">来源：</w:t>
       </w:r>
-      <w:hyperlink w:history="1" r:id="rIdlaiunqune529mhw2bt19b">
+      <w:hyperlink w:history="1" r:id="rIdjco7zmgqmvcmqtcpxc-o3">
         <w:r>
           <w:rPr>
             <w:rStyle w:val="Hyperlink"/>
@@ -1489,7 +1489,7 @@
         </w:rPr>
         <w:t xml:space="preserve">来源：</w:t>
       </w:r>
-      <w:hyperlink w:history="1" r:id="rIdvzmyvmxyexaeenbv56t-e">
+      <w:hyperlink w:history="1" r:id="rIdl-oxy_wvj2y3h2jtgcbuu">
         <w:r>
           <w:rPr>
             <w:rStyle w:val="Hyperlink"/>
@@ -1547,7 +1547,7 @@
         </w:rPr>
         <w:t xml:space="preserve">来源：</w:t>
       </w:r>
-      <w:hyperlink w:history="1" r:id="rIdsfggfqunlgg9p2mw8yhfm">
+      <w:hyperlink w:history="1" r:id="rIddazrgqkjacyox-dauc9-c">
         <w:r>
           <w:rPr>
             <w:rStyle w:val="Hyperlink"/>
@@ -1571,7 +1571,7 @@
         </w:rPr>
         <w:t xml:space="preserve"> · </w:t>
       </w:r>
-      <w:hyperlink w:history="1" r:id="rIdgcq6bxz3scout-h6vw_8h">
+      <w:hyperlink w:history="1" r:id="rId_p-f6oi42lkj2_qau8dgk">
         <w:r>
           <w:rPr>
             <w:rStyle w:val="Hyperlink"/>
@@ -1629,7 +1629,7 @@
         </w:rPr>
         <w:t xml:space="preserve">来源：</w:t>
       </w:r>
-      <w:hyperlink w:history="1" r:id="rIdsx9y5dcwa3di0uila8hu4">
+      <w:hyperlink w:history="1" r:id="rIdl7-r3xu0hehhosiahgql5">
         <w:r>
           <w:rPr>
             <w:rStyle w:val="Hyperlink"/>
@@ -1687,7 +1687,7 @@
         </w:rPr>
         <w:t xml:space="preserve">来源：</w:t>
       </w:r>
-      <w:hyperlink w:history="1" r:id="rId1tquuykb1n5aqj8iv8svt">
+      <w:hyperlink w:history="1" r:id="rIdcfhrk9heri67louegip6d">
         <w:r>
           <w:rPr>
             <w:rStyle w:val="Hyperlink"/>
@@ -1745,7 +1745,7 @@
         </w:rPr>
         <w:t xml:space="preserve">来源：</w:t>
       </w:r>
-      <w:hyperlink w:history="1" r:id="rIdzingj-yihqsdmdzlswtfj">
+      <w:hyperlink w:history="1" r:id="rIdttmppgo2lpohmnkuoe8l0">
         <w:r>
           <w:rPr>
             <w:rStyle w:val="Hyperlink"/>

</xml_diff>

<commit_message>
weekly: update W12 report (revised)
Co-Authored-By: Claude Opus 4.6 <noreply@anthropic.com>
</commit_message>
<xml_diff>
--- a/data/weekly/2026-W12.docx
+++ b/data/weekly/2026-W12.docx
@@ -40,7 +40,7 @@
           <w:sz w:val="22"/>
           <w:szCs w:val="22"/>
         </w:rPr>
-        <w:t xml:space="preserve"> 微软、Google、NVIDIA、Anthropic在同一周将Agent能力嵌入浏览器、IDE、办公套件和芯片平台——AI竞争的主战场正从模型层下沉到基础设施层，真正的问题不再是“Agent能不能用”，而是“Agent在谁的管道里运行”。</w:t>
+        <w:t xml:space="preserve"> AI竞争的决定性变量正在从模型能力转向平台控制权——本周五家巨头同步将Agent焊入各自基础设施的动作，本质上是一场锁定战，而非功能战。</w:t>
       </w:r>
     </w:p>
     <w:p>
@@ -125,25 +125,25 @@
           <w:sz w:val="22"/>
           <w:szCs w:val="22"/>
         </w:rPr>
-        <w:t xml:space="preserve">AI模型之争正在变得不重要。本周，微软、Google、NVIDIA、OpenAI几乎同时将Agent能力焊入各自的平台——办公套件、浏览器、IDE、芯片栈。这不是巧合，而是信号：</w:t>
-      </w:r>
-      <w:r>
-        <w:rPr>
-          <w:rFonts w:ascii="Arial" w:cs="Arial" w:eastAsia="Arial" w:hAnsi="Arial"/>
-          <w:b/>
-          <w:bCs/>
-          <w:sz w:val="22"/>
-          <w:szCs w:val="22"/>
-        </w:rPr>
-        <w:t xml:space="preserve">头部公司已经默认模型层将被商品化，真正的战争转移到了基础设施层——谁控制Agent运行的”管道”，谁就控制下一阶段的产业格局。</w:t>
-      </w:r>
-      <w:r>
-        <w:rPr>
-          <w:rFonts w:ascii="Arial" w:cs="Arial" w:eastAsia="Arial" w:hAnsi="Arial"/>
-          <w:sz w:val="22"/>
-          <w:szCs w:val="22"/>
-        </w:rPr>
-        <w:t xml:space="preserve"> 这场竞争的本质不是功能竞争，而是锁定竞争：一旦你的Agent在某个平台的环境中跑起来，迁移成本将使你很难离开。</w:t>
+        <w:t xml:space="preserve">模型层的竞争壁垒正在坍塌——NVIDIA把120B的Agent模型开源了，LeCun拿着10亿美元去押注LLM替代路径，Chollet公开说下一个突破需要全新范式。当最有资源的人不再相信模型本身是终局，竞争的重心自然下移。本周，微软、Google、NVIDIA、OpenAI几乎同时将Agent嵌入各自的平台基础设施：办公套件、浏览器、IDE、芯片栈、运行时架构。</w:t>
+      </w:r>
+      <w:r>
+        <w:rPr>
+          <w:rFonts w:ascii="Arial" w:cs="Arial" w:eastAsia="Arial" w:hAnsi="Arial"/>
+          <w:b/>
+          <w:bCs/>
+          <w:sz w:val="22"/>
+          <w:szCs w:val="22"/>
+        </w:rPr>
+        <w:t xml:space="preserve">这不是功能迭代，而是锁定竞争——谁控制Agent运行的环境，谁就控制用户的迁移成本。</w:t>
+      </w:r>
+      <w:r>
+        <w:rPr>
+          <w:rFonts w:ascii="Arial" w:cs="Arial" w:eastAsia="Arial" w:hAnsi="Arial"/>
+          <w:sz w:val="22"/>
+          <w:szCs w:val="22"/>
+        </w:rPr>
+        <w:t xml:space="preserve"> 与此同时，安全与合规正在成为Agent平台的准入门槛：字节跳动的Seedance 2.0因合规问题被迫暂停全球发布，证明没有安全基础设施的产品连市场都进不了。</w:t>
       </w:r>
     </w:p>
     <w:p>
@@ -183,56 +183,69 @@
           <w:sz w:val="24"/>
           <w:szCs w:val="24"/>
         </w:rPr>
-        <w:t xml:space="preserve">模型层的胜负已经不重要了</w:t>
-      </w:r>
-    </w:p>
-    <w:p>
-      <w:pPr>
-        <w:spacing w:after="160"/>
-      </w:pPr>
-      <w:r>
-        <w:rPr>
-          <w:rFonts w:ascii="Arial" w:cs="Arial" w:eastAsia="Arial" w:hAnsi="Arial"/>
-          <w:sz w:val="22"/>
-          <w:szCs w:val="22"/>
-        </w:rPr>
-        <w:t xml:space="preserve">先说一个反直觉的判断：过去两年AI竞争最核心的变量——模型能力——正在失去决定性意义。</w:t>
-      </w:r>
-    </w:p>
-    <w:p>
-      <w:pPr>
-        <w:spacing w:after="160"/>
-      </w:pPr>
-      <w:r>
-        <w:rPr>
-          <w:rFonts w:ascii="Arial" w:cs="Arial" w:eastAsia="Arial" w:hAnsi="Arial"/>
-          <w:sz w:val="22"/>
-          <w:szCs w:val="22"/>
-        </w:rPr>
-        <w:t xml:space="preserve">证据不止一条。NVIDIA本周发布了Nemotron-3-Super，一个120B参数的开放权重MoE模型，1M token上下文，64GB即可运行，明确为Agent场景设计。这意味着芯片巨头正在将”足够好的Agent模型”变成开源基础设施的一部分。同一周，Yann LeCun以10.3亿美元创纪录种子轮成立AMI Labs，公开押注LLM不是终局架构。当最有资源的玩家们不再把赌注押在”谁的模型更好”上时，模型层的竞争壁垒已经在崩塌。</w:t>
-      </w:r>
-    </w:p>
-    <w:p>
-      <w:pPr>
-        <w:spacing w:after="160"/>
-      </w:pPr>
-      <w:r>
-        <w:rPr>
-          <w:rFonts w:ascii="Arial" w:cs="Arial" w:eastAsia="Arial" w:hAnsi="Arial"/>
-          <w:sz w:val="22"/>
-          <w:szCs w:val="22"/>
-        </w:rPr>
-        <w:t xml:space="preserve">但模型层变弱不意味着竞争消失——它意味着竞争转移。问题从”谁的Agent更聪明”变成了一个更古老、也更深刻的问题：</w:t>
-      </w:r>
-      <w:r>
-        <w:rPr>
-          <w:rFonts w:ascii="Arial" w:cs="Arial" w:eastAsia="Arial" w:hAnsi="Arial"/>
-          <w:b/>
-          <w:bCs/>
-          <w:sz w:val="22"/>
-          <w:szCs w:val="22"/>
-        </w:rPr>
-        <w:t xml:space="preserve">谁的平台是Agent的默认运行环境？</w:t>
+        <w:t xml:space="preserve">模型能力正在失去决定性意义</w:t>
+      </w:r>
+    </w:p>
+    <w:p>
+      <w:pPr>
+        <w:spacing w:after="160"/>
+      </w:pPr>
+      <w:r>
+        <w:rPr>
+          <w:rFonts w:ascii="Arial" w:cs="Arial" w:eastAsia="Arial" w:hAnsi="Arial"/>
+          <w:sz w:val="22"/>
+          <w:szCs w:val="22"/>
+        </w:rPr>
+        <w:t xml:space="preserve">先说一个反直觉的判断：过去两年AI竞争最核心的变量——模型能力——正在被商品化。</w:t>
+      </w:r>
+    </w:p>
+    <w:p>
+      <w:pPr>
+        <w:spacing w:after="160"/>
+      </w:pPr>
+      <w:r>
+        <w:rPr>
+          <w:rFonts w:ascii="Arial" w:cs="Arial" w:eastAsia="Arial" w:hAnsi="Arial"/>
+          <w:sz w:val="22"/>
+          <w:szCs w:val="22"/>
+        </w:rPr>
+        <w:t xml:space="preserve">最直接的证据来自NVIDIA。本周发布的Nemotron-3-Super是一个120B参数的开放权重MoE模型，拥有1M token上下文窗口，约64GB即可运行，明确为Agent场景设计（信号4）。这意味着什么？芯片巨头不再满足于卖算力——它正在将”足够好的Agent模型”变成开源基础设施的一部分，就像Linux之于服务器、Android之于手机一样。当”足够好”可以免费获取，模型本身作为竞争壁垒的价值就在迅速消解。</w:t>
+      </w:r>
+    </w:p>
+    <w:p>
+      <w:pPr>
+        <w:spacing w:after="160"/>
+      </w:pPr>
+      <w:r>
+        <w:rPr>
+          <w:rFonts w:ascii="Arial" w:cs="Arial" w:eastAsia="Arial" w:hAnsi="Arial"/>
+          <w:sz w:val="22"/>
+          <w:szCs w:val="22"/>
+        </w:rPr>
+        <w:t xml:space="preserve">同一周，两条信号从不同方向印证了这个判断。Yann LeCun以10.3亿美元创纪录种子轮成立AMI Labs，公开押注LLM不是终局架构（信号7）。François Chollet（Keras创始人）公开表示下一个重大AI突破需要全新范式，而非在深度学习内做增量改进。这两位最具影响力的AI研究者同时对现有模型架构投下不信任票——当建模型的人都不认为模型是终局时，靠模型差异化来建护城河的策略就站不住脚了。</w:t>
+      </w:r>
+    </w:p>
+    <w:p>
+      <w:pPr>
+        <w:spacing w:after="160"/>
+      </w:pPr>
+      <w:r>
+        <w:rPr>
+          <w:rFonts w:ascii="Arial" w:cs="Arial" w:eastAsia="Arial" w:hAnsi="Arial"/>
+          <w:sz w:val="22"/>
+          <w:szCs w:val="22"/>
+        </w:rPr>
+        <w:t xml:space="preserve">但关键在于：模型层竞争壁垒的坍塌不意味着竞争消失，而是竞争转移。当Agent能力从”稀缺资源”变成”基础设施标配”，真正的问题就从”谁的Agent更聪明”变成了一个更古老、也更深刻的平台问题：</w:t>
+      </w:r>
+      <w:r>
+        <w:rPr>
+          <w:rFonts w:ascii="Arial" w:cs="Arial" w:eastAsia="Arial" w:hAnsi="Arial"/>
+          <w:b/>
+          <w:bCs/>
+          <w:sz w:val="22"/>
+          <w:szCs w:val="22"/>
+        </w:rPr>
+        <w:t xml:space="preserve">Agent在谁的环境里运行，谁就控制了用户关系和数据通路。</w:t>
       </w:r>
     </w:p>
     <w:p>
@@ -248,82 +261,69 @@
           <w:sz w:val="24"/>
           <w:szCs w:val="24"/>
         </w:rPr>
-        <w:t xml:space="preserve">这是一场锁定战，不是功能战</w:t>
-      </w:r>
-    </w:p>
-    <w:p>
-      <w:pPr>
-        <w:spacing w:after="160"/>
-      </w:pPr>
-      <w:r>
-        <w:rPr>
-          <w:rFonts w:ascii="Arial" w:cs="Arial" w:eastAsia="Arial" w:hAnsi="Arial"/>
-          <w:sz w:val="22"/>
-          <w:szCs w:val="22"/>
-        </w:rPr>
-        <w:t xml:space="preserve">理解本周发生了什么，关键不在于每家公司做了什么——而在于它们为什么同时做。</w:t>
-      </w:r>
-    </w:p>
-    <w:p>
-      <w:pPr>
-        <w:spacing w:after="160"/>
-      </w:pPr>
-      <w:r>
-        <w:rPr>
-          <w:rFonts w:ascii="Arial" w:cs="Arial" w:eastAsia="Arial" w:hAnsi="Arial"/>
-          <w:sz w:val="22"/>
-          <w:szCs w:val="22"/>
-        </w:rPr>
-        <w:t xml:space="preserve">微软通过Copilot Cowork将Anthropic的Agent嵌入Office 365全家桶；Google让Chrome原生支持Agent接入浏览器会话、同时升级Workspace的跨应用Agent能力；VS Code上线全自主Autopilot模式；NVIDIA预告GTC将发布开源Agent平台。这些动作在同一周密集释放，底层逻辑完全一致：</w:t>
-      </w:r>
-      <w:r>
-        <w:rPr>
-          <w:rFonts w:ascii="Arial" w:cs="Arial" w:eastAsia="Arial" w:hAnsi="Arial"/>
-          <w:b/>
-          <w:bCs/>
-          <w:sz w:val="22"/>
-          <w:szCs w:val="22"/>
-        </w:rPr>
-        <w:t xml:space="preserve">把Agent的执行环境焊死在自己的平台上。</w:t>
-      </w:r>
-    </w:p>
-    <w:p>
-      <w:pPr>
-        <w:spacing w:after="160"/>
-      </w:pPr>
-      <w:r>
-        <w:rPr>
-          <w:rFonts w:ascii="Arial" w:cs="Arial" w:eastAsia="Arial" w:hAnsi="Arial"/>
-          <w:sz w:val="22"/>
-          <w:szCs w:val="22"/>
-        </w:rPr>
-        <w:t xml:space="preserve">这不是在”赋能用户”——这是在抢占Agent的栖息地。</w:t>
-      </w:r>
-    </w:p>
-    <w:p>
-      <w:pPr>
-        <w:spacing w:after="160"/>
-      </w:pPr>
-      <w:r>
-        <w:rPr>
-          <w:rFonts w:ascii="Arial" w:cs="Arial" w:eastAsia="Arial" w:hAnsi="Arial"/>
-          <w:sz w:val="22"/>
-          <w:szCs w:val="22"/>
-        </w:rPr>
-        <w:t xml:space="preserve">回想一下2007年的智能手机平台战。iPhone赢得了那场战争，不是因为iOS的app质量一定比Android好，而是因为苹果控制了应用商店、支付通道和开发者工具链——应用一旦在iOS生态中深度运行，迁移到Android的成本高到用户和开发者都不愿意承受。本周的Agent平台之争遵循完全相同的逻辑：当你的跨部门工作流在Copilot Cowork里跑通了，当你的Agent通过Chrome会话访问所有已登录服务，当你的开发流程依赖VS Code Autopilot——你已经被锁定了。</w:t>
-      </w:r>
-    </w:p>
-    <w:p>
-      <w:pPr>
-        <w:spacing w:after="160"/>
-      </w:pPr>
-      <w:r>
-        <w:rPr>
-          <w:rFonts w:ascii="Arial" w:cs="Arial" w:eastAsia="Arial" w:hAnsi="Arial"/>
-          <w:sz w:val="22"/>
-          <w:szCs w:val="22"/>
-        </w:rPr>
-        <w:t xml:space="preserve">有意思的是，开源社区也看到了这个风险。OpenClaw本周获得NVIDIA和微软工程师的直接支持，MCP协议初创公司Manufact完成630万美元融资。这些”Agent的公共管道”之所以获得资源，恰恰是因为开发者需要一条不被任何单一巨头控制的通路。巨头在建围墙，开源在修公路——这正是平台锁定战的经典对抗结构。</w:t>
+        <w:t xml:space="preserve">锁定机制：Agent的栖息地之争</w:t>
+      </w:r>
+    </w:p>
+    <w:p>
+      <w:pPr>
+        <w:spacing w:after="160"/>
+      </w:pPr>
+      <w:r>
+        <w:rPr>
+          <w:rFonts w:ascii="Arial" w:cs="Arial" w:eastAsia="Arial" w:hAnsi="Arial"/>
+          <w:sz w:val="22"/>
+          <w:szCs w:val="22"/>
+        </w:rPr>
+        <w:t xml:space="preserve">理解本周发生了什么，关键不在于每家公司做了什么功能——而在于这些功能背后的共同结构逻辑：</w:t>
+      </w:r>
+      <w:r>
+        <w:rPr>
+          <w:rFonts w:ascii="Arial" w:cs="Arial" w:eastAsia="Arial" w:hAnsi="Arial"/>
+          <w:b/>
+          <w:bCs/>
+          <w:sz w:val="22"/>
+          <w:szCs w:val="22"/>
+        </w:rPr>
+        <w:t xml:space="preserve">把Agent的执行环境焊死在自己的平台上，制造迁移成本。</w:t>
+      </w:r>
+    </w:p>
+    <w:p>
+      <w:pPr>
+        <w:spacing w:after="160"/>
+      </w:pPr>
+      <w:r>
+        <w:rPr>
+          <w:rFonts w:ascii="Arial" w:cs="Arial" w:eastAsia="Arial" w:hAnsi="Arial"/>
+          <w:sz w:val="22"/>
+          <w:szCs w:val="22"/>
+        </w:rPr>
+        <w:t xml:space="preserve">具体来看这个锁定机制如何运作。微软通过Copilot Cowork将Anthropic驱动的Agent嵌入Office 365全家桶（信号1），用户描述一个目标，Agent在Word、Excel、PowerPoint之间自动调度执行——一旦你的跨部门工作流在这个环境里跑通，重新在Google Workspace中搭建等价流程的成本是极高的。同样的逻辑，Google让Chrome原生支持Agent接入浏览器会话（信号2），无需扩展、无需截图，仅需一个开关——当你的Agent通过Chrome会话访问所有已登录服务时，切换到另一个浏览器意味着丧失所有已建立的会话连接。VS Code上线全自主Autopilot模式（信号3），Agent完全控制工作流并可自动重试——当你的开发流程依赖这个模式时，IDE的选择就变成了Agent生态的选择。</w:t>
+      </w:r>
+    </w:p>
+    <w:p>
+      <w:pPr>
+        <w:spacing w:after="160"/>
+      </w:pPr>
+      <w:r>
+        <w:rPr>
+          <w:rFonts w:ascii="Arial" w:cs="Arial" w:eastAsia="Arial" w:hAnsi="Arial"/>
+          <w:sz w:val="22"/>
+          <w:szCs w:val="22"/>
+        </w:rPr>
+        <w:t xml:space="preserve">这里需要注意一个容易被忽略的细节：Anthropic同时出现在微软和自己的产品线中——它为Copilot Cowork提供底层技术，也在自己的Claude Code中推出多Agent代码审查功能（信号11）。这种”两条腿走路”的策略暗示，即使是模型提供商也意识到了平台层的重要性：仅靠模型授权（被嵌入别人的平台）是不够的，必须同时建设自己的工具生态。</w:t>
+      </w:r>
+    </w:p>
+    <w:p>
+      <w:pPr>
+        <w:spacing w:after="160"/>
+      </w:pPr>
+      <w:r>
+        <w:rPr>
+          <w:rFonts w:ascii="Arial" w:cs="Arial" w:eastAsia="Arial" w:hAnsi="Arial"/>
+          <w:sz w:val="22"/>
+          <w:szCs w:val="22"/>
+        </w:rPr>
+        <w:t xml:space="preserve">历史上最接近的类比是操作系统之争，而非智能手机之争。智能手机时代iOS和Android可以共存，因为手机是消费品、用户可以持有多台设备。但Agent平台更像企业操作系统——一个组织的工作流只会深度嵌入一个平台，迁移成本随时间累积而急剧上升。这更接近上世纪90年代Windows对企业市场的锁定逻辑：不是因为Windows最好，而是因为所有业务流程都在它上面跑，替换成本高到不可承受。</w:t>
       </w:r>
     </w:p>
     <w:p>
@@ -339,64 +339,59 @@
           <w:sz w:val="24"/>
           <w:szCs w:val="24"/>
         </w:rPr>
-        <w:t xml:space="preserve">安全不是护城河，是城门</w:t>
-      </w:r>
-    </w:p>
-    <w:p>
-      <w:pPr>
-        <w:spacing w:after="160"/>
-      </w:pPr>
-      <w:r>
-        <w:rPr>
-          <w:rFonts w:ascii="Arial" w:cs="Arial" w:eastAsia="Arial" w:hAnsi="Arial"/>
-          <w:sz w:val="22"/>
-          <w:szCs w:val="22"/>
-        </w:rPr>
-        <w:t xml:space="preserve">基础设施竞争还有一个容易被忽略的维度：在Agent平台层，安全与合规不是差异化卖点，而是准入门槛。</w:t>
-      </w:r>
-    </w:p>
-    <w:p>
-      <w:pPr>
-        <w:spacing w:after="160"/>
-      </w:pPr>
-      <w:r>
-        <w:rPr>
-          <w:rFonts w:ascii="Arial" w:cs="Arial" w:eastAsia="Arial" w:hAnsi="Arial"/>
-          <w:sz w:val="22"/>
-          <w:szCs w:val="22"/>
-        </w:rPr>
-        <w:t xml:space="preserve">最直观的案例是字节跳动本周因版权与合规风险暂停了Seedance 2.0的全球发布——产品技术上已经就绪，但缺乏合规基础设施意味着它根本无法进入市场。再看OpenAI：它不仅公开了Responses API的Agent运行时架构，还收购了安全测试平台Promptfoo，将安全能力内化为平台基础设施。Perplexity向NIST提交了AI Agent安全框架。NVIDIA宣布GTC将专题讨论自进化Agent的治理机制。</w:t>
-      </w:r>
-    </w:p>
-    <w:p>
-      <w:pPr>
-        <w:spacing w:after="160"/>
-      </w:pPr>
-      <w:r>
-        <w:rPr>
-          <w:rFonts w:ascii="Arial" w:cs="Arial" w:eastAsia="Arial" w:hAnsi="Arial"/>
-          <w:sz w:val="22"/>
-          <w:szCs w:val="22"/>
-        </w:rPr>
-        <w:t xml:space="preserve">这些动作画出一条清晰的分界线：</w:t>
-      </w:r>
-      <w:r>
-        <w:rPr>
-          <w:rFonts w:ascii="Arial" w:cs="Arial" w:eastAsia="Arial" w:hAnsi="Arial"/>
-          <w:b/>
-          <w:bCs/>
-          <w:sz w:val="22"/>
-          <w:szCs w:val="22"/>
-        </w:rPr>
-        <w:t xml:space="preserve">没有内置安全护栏的Agent平台，将被企业采购流程直接淘汰。</w:t>
-      </w:r>
-      <w:r>
-        <w:rPr>
-          <w:rFonts w:ascii="Arial" w:cs="Arial" w:eastAsia="Arial" w:hAnsi="Arial"/>
-          <w:sz w:val="22"/>
-          <w:szCs w:val="22"/>
-        </w:rPr>
-        <w:t xml:space="preserve"> 对于试图进入Agent基础设施层的新进入者来说，安全不是你可以之后再补的功能——它是你能不能坐上牌桌的门票。</w:t>
+        <w:t xml:space="preserve">开源的对抗力量：公共管道 vs. 私有围墙</w:t>
+      </w:r>
+    </w:p>
+    <w:p>
+      <w:pPr>
+        <w:spacing w:after="160"/>
+      </w:pPr>
+      <w:r>
+        <w:rPr>
+          <w:rFonts w:ascii="Arial" w:cs="Arial" w:eastAsia="Arial" w:hAnsi="Arial"/>
+          <w:sz w:val="22"/>
+          <w:szCs w:val="22"/>
+        </w:rPr>
+        <w:t xml:space="preserve">如果巨头们在建围墙，开源社区在做的就是修公路。</w:t>
+      </w:r>
+    </w:p>
+    <w:p>
+      <w:pPr>
+        <w:spacing w:after="160"/>
+      </w:pPr>
+      <w:r>
+        <w:rPr>
+          <w:rFonts w:ascii="Arial" w:cs="Arial" w:eastAsia="Arial" w:hAnsi="Arial"/>
+          <w:sz w:val="22"/>
+          <w:szCs w:val="22"/>
+        </w:rPr>
+        <w:t xml:space="preserve">OpenClaw本周获得了NVIDIA和微软工程师的直接支持（信号9），两家巨头派出工程师协助处理安全和企业集成问题。这看起来矛盾——为什么巨头要支持一个可能削弱自身平台锁定力的开源项目？答案可能是：在Agent基础设施还未定型的阶段，参与开源标准的制定比抵制它更有利——就像Google当初支持Android一样，通过开源扩大生态，再在生态之上建立自己的商业化层。</w:t>
+      </w:r>
+    </w:p>
+    <w:p>
+      <w:pPr>
+        <w:spacing w:after="160"/>
+      </w:pPr>
+      <w:r>
+        <w:rPr>
+          <w:rFonts w:ascii="Arial" w:cs="Arial" w:eastAsia="Arial" w:hAnsi="Arial"/>
+          <w:sz w:val="22"/>
+          <w:szCs w:val="22"/>
+        </w:rPr>
+        <w:t xml:space="preserve">MCP协议的初创公司Manufact完成了630万美元融资（信号12补充），正在成为连接Agent与外部工具的标准接口——类似于USB-C之于硬件设备。开发者社区已经将OpenClaw部署到人形机器人和无人机上（信号9），将Agent从数字环境扩展到物理世界。中国社区出现了OpenClaw的付费安装服务，显示非技术用户群体也在涌入这个生态。</w:t>
+      </w:r>
+    </w:p>
+    <w:p>
+      <w:pPr>
+        <w:spacing w:after="160"/>
+      </w:pPr>
+      <w:r>
+        <w:rPr>
+          <w:rFonts w:ascii="Arial" w:cs="Arial" w:eastAsia="Arial" w:hAnsi="Arial"/>
+          <w:sz w:val="22"/>
+          <w:szCs w:val="22"/>
+        </w:rPr>
+        <w:t xml:space="preserve">这种对抗结构——巨头的私有管道 vs. 开源的公共管道——将在未来数月定义Agent基础设施的竞争格局。对于在这个生态中做选择的企业来说，押注开源标准（如MCP）可能是降低平台锁定风险的最现实路径。</w:t>
       </w:r>
     </w:p>
     <w:p>
@@ -412,33 +407,142 @@
           <w:sz w:val="24"/>
           <w:szCs w:val="24"/>
         </w:rPr>
-        <w:t xml:space="preserve">为什么是本周</w:t>
-      </w:r>
-    </w:p>
-    <w:p>
-      <w:pPr>
-        <w:spacing w:after="160"/>
-      </w:pPr>
-      <w:r>
-        <w:rPr>
-          <w:rFonts w:ascii="Arial" w:cs="Arial" w:eastAsia="Arial" w:hAnsi="Arial"/>
-          <w:sz w:val="22"/>
-          <w:szCs w:val="22"/>
-        </w:rPr>
-        <w:t xml:space="preserve">这场基础设施战争不是突然出现的。它之所以在本周从潜流变为显流，有一个重要的背景条件：过去半年间，前沿模型的Agent能力密集升级——Claude在2024年10月率先推出computer use，Gemini早在2024年初就拥有100万token上下文，GPT-5.4上周又将计算机操作、长上下文和工具调用整合到一个模型中。当多家模型同时具备”足够用”的Agent能力后，模型层不再是瓶颈，竞争自然转向”Agent如何安全、稳定地嵌入用户的日常工作环境”——这正是基础设施层要解决的问题。</w:t>
-      </w:r>
-    </w:p>
-    <w:p>
-      <w:pPr>
-        <w:spacing w:after="160"/>
-      </w:pPr>
-      <w:r>
-        <w:rPr>
-          <w:rFonts w:ascii="Arial" w:cs="Arial" w:eastAsia="Arial" w:hAnsi="Arial"/>
-          <w:sz w:val="22"/>
-          <w:szCs w:val="22"/>
-        </w:rPr>
-        <w:t xml:space="preserve">a16z本周发布的报告精确命名了这个瓶颈：</w:t>
+        <w:t xml:space="preserve">安全不是附加功能，是准入门槛</w:t>
+      </w:r>
+    </w:p>
+    <w:p>
+      <w:pPr>
+        <w:spacing w:after="160"/>
+      </w:pPr>
+      <w:r>
+        <w:rPr>
+          <w:rFonts w:ascii="Arial" w:cs="Arial" w:eastAsia="Arial" w:hAnsi="Arial"/>
+          <w:sz w:val="22"/>
+          <w:szCs w:val="22"/>
+        </w:rPr>
+        <w:t xml:space="preserve">基础设施层的竞争还有第三个维度，比功能和锁定都更刚性：</w:t>
+      </w:r>
+      <w:r>
+        <w:rPr>
+          <w:rFonts w:ascii="Arial" w:cs="Arial" w:eastAsia="Arial" w:hAnsi="Arial"/>
+          <w:b/>
+          <w:bCs/>
+          <w:sz w:val="22"/>
+          <w:szCs w:val="22"/>
+        </w:rPr>
+        <w:t xml:space="preserve">没有安全基础设施的Agent平台，连参赛资格都没有。</w:t>
+      </w:r>
+    </w:p>
+    <w:p>
+      <w:pPr>
+        <w:spacing w:after="160"/>
+      </w:pPr>
+      <w:r>
+        <w:rPr>
+          <w:rFonts w:ascii="Arial" w:cs="Arial" w:eastAsia="Arial" w:hAnsi="Arial"/>
+          <w:sz w:val="22"/>
+          <w:szCs w:val="22"/>
+        </w:rPr>
+        <w:t xml:space="preserve">最直接的证据是字节跳动：Seedance 2.0视频生成器技术上已经就绪，但因版权与合规风险被迫暂停全球发布（信号10）——工程师和法务团队仍在解决法律问题。这不是一个”安全做得好可以加分”的故事，而是一个”安全做不好直接出局”的故事。</w:t>
+      </w:r>
+    </w:p>
+    <w:p>
+      <w:pPr>
+        <w:spacing w:after="160"/>
+      </w:pPr>
+      <w:r>
+        <w:rPr>
+          <w:rFonts w:ascii="Arial" w:cs="Arial" w:eastAsia="Arial" w:hAnsi="Arial"/>
+          <w:sz w:val="22"/>
+          <w:szCs w:val="22"/>
+        </w:rPr>
+        <w:t xml:space="preserve">看清这一点的公司已经在行动。OpenAI收购了安全测试平台Promptfoo（信号5），将外部安全评估能力直接内化为平台基础设施的一部分——这比开发一个安全功能要激进得多，它意味着OpenAI判断安全能力需要深度集成到Agent运行时中，而非作为外部插件。同一周，OpenAI还发布了IH-Challenge（指令层级挑战），训练模型抵抗提示注入攻击。Perplexity向NIST提交了AI Agent安全框架（信号12），基于自身构建和部署Agent的实践经验。NVIDIA宣布GTC将专题讨论如何为自进化Agent构建治理基础设施。</w:t>
+      </w:r>
+    </w:p>
+    <w:p>
+      <w:pPr>
+        <w:spacing w:after="160"/>
+      </w:pPr>
+      <w:r>
+        <w:rPr>
+          <w:rFonts w:ascii="Arial" w:cs="Arial" w:eastAsia="Arial" w:hAnsi="Arial"/>
+          <w:sz w:val="22"/>
+          <w:szCs w:val="22"/>
+        </w:rPr>
+        <w:t xml:space="preserve">这些动作共同指向一个结论：</w:t>
+      </w:r>
+      <w:r>
+        <w:rPr>
+          <w:rFonts w:ascii="Arial" w:cs="Arial" w:eastAsia="Arial" w:hAnsi="Arial"/>
+          <w:b/>
+          <w:bCs/>
+          <w:sz w:val="22"/>
+          <w:szCs w:val="22"/>
+        </w:rPr>
+        <w:t xml:space="preserve">在Agent基础设施的企业采购中，安全与合规能力将是筛选条件，而非加分项。</w:t>
+      </w:r>
+      <w:r>
+        <w:rPr>
+          <w:rFonts w:ascii="Arial" w:cs="Arial" w:eastAsia="Arial" w:hAnsi="Arial"/>
+          <w:sz w:val="22"/>
+          <w:szCs w:val="22"/>
+        </w:rPr>
+        <w:t xml:space="preserve"> 这对新进入者意味着什么？你不能先把产品做出来再补安全——安全是你能不能坐上牌桌的门票。字节跳动的遭遇已经证明了这一点。</w:t>
+      </w:r>
+    </w:p>
+    <w:p>
+      <w:pPr>
+        <w:spacing w:after="160" w:before="280"/>
+      </w:pPr>
+      <w:r>
+        <w:rPr>
+          <w:rFonts w:ascii="Arial" w:cs="Arial" w:eastAsia="Arial" w:hAnsi="Arial"/>
+          <w:b/>
+          <w:bCs/>
+          <w:color w:val="2E75B6"/>
+          <w:sz w:val="24"/>
+          <w:szCs w:val="24"/>
+        </w:rPr>
+        <w:t xml:space="preserve">为什么这场转移在本周变得可见</w:t>
+      </w:r>
+    </w:p>
+    <w:p>
+      <w:pPr>
+        <w:spacing w:after="160"/>
+      </w:pPr>
+      <w:r>
+        <w:rPr>
+          <w:rFonts w:ascii="Arial" w:cs="Arial" w:eastAsia="Arial" w:hAnsi="Arial"/>
+          <w:sz w:val="22"/>
+          <w:szCs w:val="22"/>
+        </w:rPr>
+        <w:t xml:space="preserve">基础设施竞争不是本周才开始的。但本周是它从潜流变为显流的转折点，原因有二。</w:t>
+      </w:r>
+    </w:p>
+    <w:p>
+      <w:pPr>
+        <w:spacing w:after="160"/>
+      </w:pPr>
+      <w:r>
+        <w:rPr>
+          <w:rFonts w:ascii="Arial" w:cs="Arial" w:eastAsia="Arial" w:hAnsi="Arial"/>
+          <w:sz w:val="22"/>
+          <w:szCs w:val="22"/>
+        </w:rPr>
+        <w:t xml:space="preserve">第一个条件是模型能力的”充分供给”。过去半年间，前沿模型的Agent能力密集升级：Claude在2024年10月率先推出computer use，Gemini早在2024年初就拥有100万token上下文，GPT-5.4上周将计算机操作、长上下文和工具调用整合到一个模型中。当多家模型同时具备”足够用”的Agent能力，模型层就不再是产业瓶颈——注意力和资源自然流向下一个瓶颈。</w:t>
+      </w:r>
+    </w:p>
+    <w:p>
+      <w:pPr>
+        <w:spacing w:after="160"/>
+      </w:pPr>
+      <w:r>
+        <w:rPr>
+          <w:rFonts w:ascii="Arial" w:cs="Arial" w:eastAsia="Arial" w:hAnsi="Arial"/>
+          <w:sz w:val="22"/>
+          <w:szCs w:val="22"/>
+        </w:rPr>
+        <w:t xml:space="preserve">第二个条件是瓶颈被命名。a16z本周发布的报告精确地指出了Agent落地的真正障碍：</w:t>
       </w:r>
       <w:r>
         <w:rPr>
@@ -456,20 +560,20 @@
           <w:sz w:val="22"/>
           <w:szCs w:val="22"/>
         </w:rPr>
-        <w:t xml:space="preserve">——将企业混乱的数据转化为Agent可操作的结构化上下文。这是一个基础设施问题，不是模型问题。</w:t>
-      </w:r>
-    </w:p>
-    <w:p>
-      <w:pPr>
-        <w:spacing w:after="160"/>
-      </w:pPr>
-      <w:r>
-        <w:rPr>
-          <w:rFonts w:ascii="Arial" w:cs="Arial" w:eastAsia="Arial" w:hAnsi="Arial"/>
-          <w:sz w:val="22"/>
-          <w:szCs w:val="22"/>
-        </w:rPr>
-        <w:t xml:space="preserve">一个附带值得注意的信号：Meta收购了Moltbook——一个只允许AI Agent发帖、人类只能观看的社交网络。这暗示了基础设施竞争的下一个延伸方向：Agent不仅需要在人类的工作流中运行，还可能需要自己的交互网络。控制Agent社交空间的平台，控制的是Agent经济的另一个入口。</w:t>
+        <w:t xml:space="preserve">——如何将企业混乱、分散的数据转化为Agent可操作的结构化上下文（信号6，3/11）。这不是一个模型问题——再强的模型，面对碎片化的企业数据也无能为力。这是一个基础设施问题。谁能最好地解决它，谁就有机会成为Agent时代的”操作系统”。</w:t>
+      </w:r>
+    </w:p>
+    <w:p>
+      <w:pPr>
+        <w:spacing w:after="160"/>
+      </w:pPr>
+      <w:r>
+        <w:rPr>
+          <w:rFonts w:ascii="Arial" w:cs="Arial" w:eastAsia="Arial" w:hAnsi="Arial"/>
+          <w:sz w:val="22"/>
+          <w:szCs w:val="22"/>
+        </w:rPr>
+        <w:t xml:space="preserve">这两个条件的同时成熟，解释了为什么五家巨头在同一周做出了方向一致的动作：它们都判断窗口期已经到来，基础设施层的卡位战不能再等了。</w:t>
       </w:r>
     </w:p>
     <w:p>
@@ -503,6 +607,8 @@
       <w:r>
         <w:rPr>
           <w:rFonts w:ascii="Arial" w:cs="Arial" w:eastAsia="Arial" w:hAnsi="Arial"/>
+          <w:b/>
+          <w:bCs/>
           <w:sz w:val="22"/>
           <w:szCs w:val="22"/>
         </w:rPr>
@@ -511,46 +617,56 @@
       <w:r>
         <w:rPr>
           <w:rFonts w:ascii="Arial" w:cs="Arial" w:eastAsia="Arial" w:hAnsi="Arial"/>
-          <w:b/>
-          <w:bCs/>
-          <w:sz w:val="22"/>
-          <w:szCs w:val="22"/>
-        </w:rPr>
-        <w:t xml:space="preserve">选择Agent运行的平台，可能比选择底层模型更重要。</w:t>
-      </w:r>
-      <w:r>
-        <w:rPr>
-          <w:rFonts w:ascii="Arial" w:cs="Arial" w:eastAsia="Arial" w:hAnsi="Arial"/>
-          <w:sz w:val="22"/>
-          <w:szCs w:val="22"/>
-        </w:rPr>
-        <w:t xml:space="preserve"> 微软、Google、NVIDIA正在构建的不是模型，而是Agent的执行环境。一旦你的Agent深度嵌入某个平台（Office 365、Chrome、NVIDIA栈），迁移成本将急剧上升。建议在早期保持平台中立性——优先采用MCP等标准协议连接Agent与外部系统，避免过早锁定。</w:t>
-      </w:r>
-    </w:p>
-    <w:p>
-      <w:pPr>
-        <w:spacing w:after="160"/>
-      </w:pPr>
-      <w:r>
-        <w:rPr>
-          <w:rFonts w:ascii="Arial" w:cs="Arial" w:eastAsia="Arial" w:hAnsi="Arial"/>
-          <w:sz w:val="22"/>
-          <w:szCs w:val="22"/>
-        </w:rPr>
-        <w:t xml:space="preserve">对AI安全研究者和从业者：安全能力正从“可选”变为Agent基础设施的核心组件。OpenAI收购Promptfoo、Perplexity向NIST提交安全框架、NVIDIA在GTC专题讨论Agent治理——这些信号表明，能够提供系统化安全测试与合规能力的公司或团队，将在Agent基础设施层获得结构性优势。</w:t>
-      </w:r>
-    </w:p>
-    <w:p>
-      <w:pPr>
-        <w:spacing w:after="160"/>
-      </w:pPr>
-      <w:r>
-        <w:rPr>
-          <w:rFonts w:ascii="Arial" w:cs="Arial" w:eastAsia="Arial" w:hAnsi="Arial"/>
-          <w:sz w:val="22"/>
-          <w:szCs w:val="22"/>
-        </w:rPr>
-        <w:t xml:space="preserve">对投资者：关注“Agent中间件”赛道。本周MCP协议初创公司Manufact的630万美元融资是一个早期信号。连接Agent与企业数据的“上下文层”、Agent安全测试工具、跨平台Agent编排——这些基础设施组件的投资价值，可能超过对单一模型公司的押注。</w:t>
+          <w:sz w:val="22"/>
+          <w:szCs w:val="22"/>
+        </w:rPr>
+        <w:t xml:space="preserve"> 选择Agent运行的平台，可能比选择底层模型更重要。微软、Google、NVIDIA正在构建的不是模型，而是Agent的执行环境——而执行环境一旦选定，迁移成本会随时间累积急剧上升。建议在早期保持平台中立性：优先采用MCP等标准协议连接Agent与外部系统，避免过早锁定单一平台。如果必须选择，至少确保核心数据和工作流定义可以导出。</w:t>
+      </w:r>
+    </w:p>
+    <w:p>
+      <w:pPr>
+        <w:spacing w:after="160"/>
+      </w:pPr>
+      <w:r>
+        <w:rPr>
+          <w:rFonts w:ascii="Arial" w:cs="Arial" w:eastAsia="Arial" w:hAnsi="Arial"/>
+          <w:b/>
+          <w:bCs/>
+          <w:sz w:val="22"/>
+          <w:szCs w:val="22"/>
+        </w:rPr>
+        <w:t xml:space="preserve">对AI安全团队：</w:t>
+      </w:r>
+      <w:r>
+        <w:rPr>
+          <w:rFonts w:ascii="Arial" w:cs="Arial" w:eastAsia="Arial" w:hAnsi="Arial"/>
+          <w:sz w:val="22"/>
+          <w:szCs w:val="22"/>
+        </w:rPr>
+        <w:t xml:space="preserve"> 安全能力正在从”可选”变为Agent基础设施的核心组件。OpenAI通过收购（而非自建）获取Promptfoo的安全测试能力，Perplexity向NIST提交安全框架，NVIDIA在GTC专题讨论Agent治理——这些信号表明，能提供系统化安全测试与合规能力的团队，将在Agent平台竞争中获得结构性需求。字节跳动的案例是最好的反面教材：安全不是上线后再补的功能。</w:t>
+      </w:r>
+    </w:p>
+    <w:p>
+      <w:pPr>
+        <w:spacing w:after="160"/>
+      </w:pPr>
+      <w:r>
+        <w:rPr>
+          <w:rFonts w:ascii="Arial" w:cs="Arial" w:eastAsia="Arial" w:hAnsi="Arial"/>
+          <w:b/>
+          <w:bCs/>
+          <w:sz w:val="22"/>
+          <w:szCs w:val="22"/>
+        </w:rPr>
+        <w:t xml:space="preserve">对投资者：</w:t>
+      </w:r>
+      <w:r>
+        <w:rPr>
+          <w:rFonts w:ascii="Arial" w:cs="Arial" w:eastAsia="Arial" w:hAnsi="Arial"/>
+          <w:sz w:val="22"/>
+          <w:szCs w:val="22"/>
+        </w:rPr>
+        <w:t xml:space="preserve"> 关注Agent中间件赛道。Manufact的630万美元融资是一个早期信号。连接Agent与企业数据的上下文层、Agent安全测试工具、跨平台Agent编排工具——这些基础设施组件的投资价值，可能超过对单一模型公司的押注。历史上，平台战的最大受益者往往不是平台本身，而是跨平台的中间件和工具。</w:t>
       </w:r>
     </w:p>
     <w:p>
@@ -602,7 +718,7 @@
           <w:sz w:val="22"/>
           <w:szCs w:val="22"/>
         </w:rPr>
-        <w:t xml:space="preserve">W11预测1：“CoT监控的可靠性将成为未来数月AI安全领域的核心争议焦点”——</w:t>
+        <w:t xml:space="preserve">W11预测1：”CoT监控的可靠性将成为未来数月AI安全领域的核心争议焦点”——</w:t>
       </w:r>
       <w:r>
         <w:rPr>
@@ -633,7 +749,7 @@
           <w:sz w:val="22"/>
           <w:szCs w:val="22"/>
         </w:rPr>
-        <w:t xml:space="preserve">W11预测2：“模型厂商的自有安全评估将面临越来越多的公信力挑战，第三方独立安全评估的需求将显著增长”——</w:t>
+        <w:t xml:space="preserve">W11预测2：”模型厂商的自有安全评估将面临越来越多的公信力挑战，第三方独立安全评估的需求将显著增长”——</w:t>
       </w:r>
       <w:r>
         <w:rPr>
@@ -766,7 +882,7 @@
           <w:sz w:val="22"/>
           <w:szCs w:val="22"/>
         </w:rPr>
-        <w:t xml:space="preserve">未来数月，“Agent平台锁定”将成为企业AI采购的核心争议。</w:t>
+        <w:t xml:space="preserve">未来数月，”Agent平台锁定”将成为企业AI采购的核心争议。</w:t>
       </w:r>
       <w:r>
         <w:rPr>
@@ -932,7 +1048,7 @@
           <w:sz w:val="22"/>
           <w:szCs w:val="22"/>
         </w:rPr>
-        <w:t xml:space="preserve">首批“Agent平台锁定”案例</w:t>
+        <w:t xml:space="preserve">首批”Agent平台锁定”案例</w:t>
       </w:r>
       <w:r>
         <w:rPr>
@@ -1011,7 +1127,7 @@
         </w:rPr>
         <w:t xml:space="preserve">来源：</w:t>
       </w:r>
-      <w:hyperlink w:history="1" r:id="rIdzkvqblhewdk4r07csnsys">
+      <w:hyperlink w:history="1" r:id="rIddqkngo0f8z3xolisauuju">
         <w:r>
           <w:rPr>
             <w:rStyle w:val="Hyperlink"/>
@@ -1069,7 +1185,7 @@
         </w:rPr>
         <w:t xml:space="preserve">来源：</w:t>
       </w:r>
-      <w:hyperlink w:history="1" r:id="rId9azefal_gqodhri-ebpre">
+      <w:hyperlink w:history="1" r:id="rId-fbxhcrtg3a6roxny_ofu">
         <w:r>
           <w:rPr>
             <w:rStyle w:val="Hyperlink"/>
@@ -1127,7 +1243,7 @@
         </w:rPr>
         <w:t xml:space="preserve">来源：</w:t>
       </w:r>
-      <w:hyperlink w:history="1" r:id="rIdcauduq6y8je6aaotd0ljw">
+      <w:hyperlink w:history="1" r:id="rId1gebekmfswgfogptvwxca">
         <w:r>
           <w:rPr>
             <w:rStyle w:val="Hyperlink"/>
@@ -1185,7 +1301,7 @@
         </w:rPr>
         <w:t xml:space="preserve">来源：</w:t>
       </w:r>
-      <w:hyperlink w:history="1" r:id="rIdzb-ogrcaovwmdizuza5ka">
+      <w:hyperlink w:history="1" r:id="rIdrn_ssssg4euyuvter4uve">
         <w:r>
           <w:rPr>
             <w:rStyle w:val="Hyperlink"/>
@@ -1209,7 +1325,7 @@
         </w:rPr>
         <w:t xml:space="preserve"> · </w:t>
       </w:r>
-      <w:hyperlink w:history="1" r:id="rId723h0r0qb9re-7srona_u">
+      <w:hyperlink w:history="1" r:id="rId4xhrajuywzsgjlmu4bdpt">
         <w:r>
           <w:rPr>
             <w:rStyle w:val="Hyperlink"/>
@@ -1267,7 +1383,7 @@
         </w:rPr>
         <w:t xml:space="preserve">来源：</w:t>
       </w:r>
-      <w:hyperlink w:history="1" r:id="rIdn_kd9ew0qiaxmwuc2hdnu">
+      <w:hyperlink w:history="1" r:id="rIdwbdppciora45u3sjqcusu">
         <w:r>
           <w:rPr>
             <w:rStyle w:val="Hyperlink"/>
@@ -1291,7 +1407,7 @@
         </w:rPr>
         <w:t xml:space="preserve"> · </w:t>
       </w:r>
-      <w:hyperlink w:history="1" r:id="rIde8md6choa6jkkatu_q3jj">
+      <w:hyperlink w:history="1" r:id="rIdp1ipp3lsyuri5kojva4qw">
         <w:r>
           <w:rPr>
             <w:rStyle w:val="Hyperlink"/>
@@ -1349,7 +1465,7 @@
         </w:rPr>
         <w:t xml:space="preserve">来源：</w:t>
       </w:r>
-      <w:hyperlink w:history="1" r:id="rIdflyoeuvjsza5yz8dkumaw">
+      <w:hyperlink w:history="1" r:id="rIdg4cjmj3zpafsbuaggdgxa">
         <w:r>
           <w:rPr>
             <w:rStyle w:val="Hyperlink"/>
@@ -1373,7 +1489,7 @@
         </w:rPr>
         <w:t xml:space="preserve"> · </w:t>
       </w:r>
-      <w:hyperlink w:history="1" r:id="rIdknbmvgoaqiz2hh13dbw2t">
+      <w:hyperlink w:history="1" r:id="rIdzjuxemyzxokg1hnmxjdan">
         <w:r>
           <w:rPr>
             <w:rStyle w:val="Hyperlink"/>
@@ -1431,7 +1547,7 @@
         </w:rPr>
         <w:t xml:space="preserve">来源：</w:t>
       </w:r>
-      <w:hyperlink w:history="1" r:id="rIdjco7zmgqmvcmqtcpxc-o3">
+      <w:hyperlink w:history="1" r:id="rIdrqian5thjm4p92trxj-ki">
         <w:r>
           <w:rPr>
             <w:rStyle w:val="Hyperlink"/>
@@ -1489,7 +1605,7 @@
         </w:rPr>
         <w:t xml:space="preserve">来源：</w:t>
       </w:r>
-      <w:hyperlink w:history="1" r:id="rIdl-oxy_wvj2y3h2jtgcbuu">
+      <w:hyperlink w:history="1" r:id="rId28r8hkuq-swqw1-unmk-t">
         <w:r>
           <w:rPr>
             <w:rStyle w:val="Hyperlink"/>
@@ -1547,7 +1663,7 @@
         </w:rPr>
         <w:t xml:space="preserve">来源：</w:t>
       </w:r>
-      <w:hyperlink w:history="1" r:id="rIddazrgqkjacyox-dauc9-c">
+      <w:hyperlink w:history="1" r:id="rIdwexay98j4wuzjakcuh9md">
         <w:r>
           <w:rPr>
             <w:rStyle w:val="Hyperlink"/>
@@ -1571,7 +1687,7 @@
         </w:rPr>
         <w:t xml:space="preserve"> · </w:t>
       </w:r>
-      <w:hyperlink w:history="1" r:id="rId_p-f6oi42lkj2_qau8dgk">
+      <w:hyperlink w:history="1" r:id="rIdmdfs_rs1fprqkxo720iu8">
         <w:r>
           <w:rPr>
             <w:rStyle w:val="Hyperlink"/>
@@ -1629,7 +1745,7 @@
         </w:rPr>
         <w:t xml:space="preserve">来源：</w:t>
       </w:r>
-      <w:hyperlink w:history="1" r:id="rIdl7-r3xu0hehhosiahgql5">
+      <w:hyperlink w:history="1" r:id="rIdt1i8jxiafn3hukbigywxe">
         <w:r>
           <w:rPr>
             <w:rStyle w:val="Hyperlink"/>
@@ -1687,7 +1803,7 @@
         </w:rPr>
         <w:t xml:space="preserve">来源：</w:t>
       </w:r>
-      <w:hyperlink w:history="1" r:id="rIdcfhrk9heri67louegip6d">
+      <w:hyperlink w:history="1" r:id="rId_tlaij7pag8tbgknthetf">
         <w:r>
           <w:rPr>
             <w:rStyle w:val="Hyperlink"/>
@@ -1745,7 +1861,7 @@
         </w:rPr>
         <w:t xml:space="preserve">来源：</w:t>
       </w:r>
-      <w:hyperlink w:history="1" r:id="rIdttmppgo2lpohmnkuoe8l0">
+      <w:hyperlink w:history="1" r:id="rIdjsjdjis0qz8toqo0o4et8">
         <w:r>
           <w:rPr>
             <w:rStyle w:val="Hyperlink"/>

</xml_diff>